<commit_message>
Update ShopFlow student downloads
</commit_message>
<xml_diff>
--- a/resources/ShopFlow_E-Commerce_Database_Analytics_Worksheet_Fall_2026.docx
+++ b/resources/ShopFlow_E-Commerce_Database_Analytics_Worksheet_Fall_2026.docx
@@ -1525,7 +1525,7 @@
                 <w:rFonts w:ascii="Aptos" w:hAnsi="Aptos" w:eastAsia="Aptos"/>
                 <w:sz w:val="18"/>
               </w:rPr>
-              <w:t>Five labeled Plotly or equivalent interactive charts</w:t>
+              <w:t>Five labeled Plotly interactive charts</w:t>
             </w:r>
           </w:p>
         </w:tc>
@@ -3837,7 +3837,7 @@
                 <w:rFonts w:ascii="Aptos" w:hAnsi="Aptos" w:eastAsia="Aptos"/>
                 <w:sz w:val="18"/>
               </w:rPr>
-              <w:t>Which customer segments have the highest lifetime value?</w:t>
+              <w:t>Which customer segments generate the most Delivered revenue?</w:t>
             </w:r>
           </w:p>
         </w:tc>
@@ -3861,7 +3861,7 @@
                 <w:rFonts w:ascii="Aptos" w:hAnsi="Aptos" w:eastAsia="Aptos"/>
                 <w:sz w:val="18"/>
               </w:rPr>
-              <w:t>GROUP BY, AVG, COUNT, SUM</w:t>
+              <w:t>JOIN, GROUP BY, aggregation</w:t>
             </w:r>
           </w:p>
         </w:tc>
@@ -3916,7 +3916,7 @@
                 <w:rFonts w:ascii="Aptos" w:hAnsi="Aptos" w:eastAsia="Aptos"/>
                 <w:sz w:val="18"/>
               </w:rPr>
-              <w:t>What are the top 10 revenue-generating products?</w:t>
+              <w:t>Which products lead by Delivered revenue and quantity?</w:t>
             </w:r>
           </w:p>
         </w:tc>
@@ -3941,7 +3941,7 @@
                 <w:rFonts w:ascii="Aptos" w:hAnsi="Aptos" w:eastAsia="Aptos"/>
                 <w:sz w:val="18"/>
               </w:rPr>
-              <w:t>JOIN, SUM, ORDER BY, LIMIT</w:t>
+              <w:t>multiple aggregations, sorting</w:t>
             </w:r>
           </w:p>
         </w:tc>
@@ -3994,7 +3994,7 @@
                 <w:rFonts w:ascii="Aptos" w:hAnsi="Aptos" w:eastAsia="Aptos"/>
                 <w:sz w:val="18"/>
               </w:rPr>
-              <w:t>What monthly revenue patterns appear?</w:t>
+              <w:t>What is customer lifetime value by customer segment?</w:t>
             </w:r>
           </w:p>
         </w:tc>
@@ -4018,7 +4018,7 @@
                 <w:rFonts w:ascii="Aptos" w:hAnsi="Aptos" w:eastAsia="Aptos"/>
                 <w:sz w:val="18"/>
               </w:rPr>
-              <w:t>date functions, aggregation</w:t>
+              <w:t>staged calculations, grouping</w:t>
             </w:r>
           </w:p>
         </w:tc>
@@ -4151,7 +4151,7 @@
                 <w:rFonts w:ascii="Aptos" w:hAnsi="Aptos" w:eastAsia="Aptos"/>
                 <w:sz w:val="18"/>
               </w:rPr>
-              <w:t>How does support resolution time vary by priority?</w:t>
+              <w:t>Which support issues occur most often by category and priority?</w:t>
             </w:r>
           </w:p>
         </w:tc>
@@ -4175,7 +4175,7 @@
                 <w:rFonts w:ascii="Aptos" w:hAnsi="Aptos" w:eastAsia="Aptos"/>
                 <w:sz w:val="18"/>
               </w:rPr>
-              <w:t>AVG, date/time difference, GROUP BY</w:t>
+              <w:t>multi-level grouping</w:t>
             </w:r>
           </w:p>
         </w:tc>
@@ -4230,7 +4230,7 @@
                 <w:rFonts w:ascii="Aptos" w:hAnsi="Aptos" w:eastAsia="Aptos"/>
                 <w:sz w:val="18"/>
               </w:rPr>
-              <w:t>How are product ratings distributed?</w:t>
+              <w:t>How are ratings distributed within each product category?</w:t>
             </w:r>
           </w:p>
         </w:tc>
@@ -4255,7 +4255,7 @@
                 <w:rFonts w:ascii="Aptos" w:hAnsi="Aptos" w:eastAsia="Aptos"/>
                 <w:sz w:val="18"/>
               </w:rPr>
-              <w:t>counts, percentages, subquery/CTE</w:t>
+              <w:t>percentages, subquery/CTE</w:t>
             </w:r>
           </w:p>
         </w:tc>
@@ -4308,7 +4308,7 @@
                 <w:rFonts w:ascii="Aptos" w:hAnsi="Aptos" w:eastAsia="Aptos"/>
                 <w:sz w:val="18"/>
               </w:rPr>
-              <w:t>What are the order completion and cancellation rates?</w:t>
+              <w:t>What are the Delivered, Cancelled, and other order-status rates?</w:t>
             </w:r>
           </w:p>
         </w:tc>
@@ -4332,7 +4332,7 @@
                 <w:rFonts w:ascii="Aptos" w:hAnsi="Aptos" w:eastAsia="Aptos"/>
                 <w:sz w:val="18"/>
               </w:rPr>
-              <w:t>status counts, ratios</w:t>
+              <w:t>conditional aggregation, ratios</w:t>
             </w:r>
           </w:p>
         </w:tc>
@@ -4387,7 +4387,7 @@
                 <w:rFonts w:ascii="Aptos" w:hAnsi="Aptos" w:eastAsia="Aptos"/>
                 <w:sz w:val="18"/>
               </w:rPr>
-              <w:t>Which customers make repeat purchases?</w:t>
+              <w:t>How does Delivered revenue change by month or season?</w:t>
             </w:r>
           </w:p>
         </w:tc>
@@ -4412,7 +4412,7 @@
                 <w:rFonts w:ascii="Aptos" w:hAnsi="Aptos" w:eastAsia="Aptos"/>
                 <w:sz w:val="18"/>
               </w:rPr>
-              <w:t>HAVING, COUNT DISTINCT, dates</w:t>
+              <w:t>date functions, time series</w:t>
             </w:r>
           </w:p>
         </w:tc>
@@ -4544,7 +4544,7 @@
                 <w:rFonts w:ascii="Aptos" w:hAnsi="Aptos" w:eastAsia="Aptos"/>
                 <w:sz w:val="18"/>
               </w:rPr>
-              <w:t>Which products may need replenishment attention?</w:t>
+              <w:t>What does repeat-purchase behavior reveal about retention?</w:t>
             </w:r>
           </w:p>
         </w:tc>
@@ -4569,7 +4569,7 @@
                 <w:rFonts w:ascii="Aptos" w:hAnsi="Aptos" w:eastAsia="Aptos"/>
                 <w:sz w:val="18"/>
               </w:rPr>
-              <w:t>stock threshold, order demand, CASE</w:t>
+              <w:t>COUNT DISTINCT, CTE/window, cohorts</w:t>
             </w:r>
           </w:p>
         </w:tc>
@@ -4601,7 +4601,7 @@
         <w:rPr>
           <w:rFonts w:ascii="Aptos" w:hAnsi="Aptos" w:eastAsia="Aptos"/>
         </w:rPr>
-        <w:t>Aggregate order-item revenue at the correct grain before joining one-to-many review or support data. If a join multiplies rows, revenue will be overstated. Compare the result with your independent control total.</w:t>
+        <w:t>For every revenue analysis, include only orders whose order_status is Delivered and calculate each line as quantity × unit_price. Aggregate at the order-item grain before joining one-to-many review or support data. If line_total is supplied, validate it against the calculation rather than silently switching definitions. Compare the result with your independent control total.</w:t>
       </w:r>
     </w:p>
     <w:p>
@@ -4653,7 +4653,7 @@
         <w:rPr>
           <w:rFonts w:ascii="Aptos" w:hAnsi="Aptos" w:eastAsia="Aptos"/>
         </w:rPr>
-        <w:t>Create five interactive visualizations using Plotly or an equivalent library:</w:t>
+        <w:t>Create five interactive visualizations using Plotly:</w:t>
       </w:r>
     </w:p>
     <w:p>

</xml_diff>